<commit_message>
Validate quantum density operators and record reproducible decoder evidence
</commit_message>
<xml_diff>
--- a/report/Quantum_Radiation_Flow_APA_Report.docx
+++ b/report/Quantum_Radiation_Flow_APA_Report.docx
@@ -68,7 +68,7 @@
           <w:color w:val="000000"/>
           <w:sz w:val="24"/>
         </w:rPr>
-        <w:t>PhD Research Program in Statistics</w:t>
+        <w:t>Independent Research in Statistics</w:t>
       </w:r>
     </w:p>
     <w:p>
@@ -100,7 +100,7 @@
           <w:color w:val="000000"/>
           <w:sz w:val="24"/>
         </w:rPr>
-        <w:t>August 24, 2026</w:t>
+        <w:t>October 12, 2026</w:t>
       </w:r>
     </w:p>
     <w:p>
@@ -153,7 +153,7 @@
           <w:color w:val="000000"/>
           <w:sz w:val="24"/>
         </w:rPr>
-        <w:t>The experiment conditions every coupling block on time and stopped mass, trains by likelihood or reverse-KL variational free energy, and adds paired latent alignment. Alignment addresses a formal non-identifiability caused by the rotational symmetry of a spherical Gaussian base. A frozen reference scrambler and a Page-time visibility transition define an exact-density benchmark in which later radiation becomes correlated with a toy complex secret. Evaluation keeps quantum Page entropy, classical flow entropy, both KL directions, Monte Carlo error, round-trip error, and paired pure-state fidelity as distinct estimands.</w:t>
+        <w:t>The experiment conditions every coupling block on time and stopped mass, fits the baseline by likelihood and paired latent alignment, and exposes a reverse-KL objective for custom optimization. Alignment addresses a formal non-identifiability caused by the rotational symmetry of a spherical Gaussian base. A frozen reference scrambler and a Page-time visibility transition define an exact-density benchmark in which later radiation becomes correlated with a toy complex secret. Evaluation keeps quantum Page entropy, classical flow entropy, both KL directions, Monte Carlo error, round-trip error, and paired pure-state fidelity as distinct estimands.</w:t>
       </w:r>
     </w:p>
     <w:p>
@@ -243,6 +243,7 @@
     </w:p>
     <w:p>
       <w:pPr>
+        <w:keepNext/>
         <w:spacing w:before="100" w:after="0"/>
       </w:pPr>
       <w:r>
@@ -258,6 +259,7 @@
     </w:p>
     <w:p>
       <w:pPr>
+        <w:keepNext/>
         <w:spacing w:after="80"/>
       </w:pPr>
       <w:r>
@@ -273,6 +275,7 @@
     </w:p>
     <w:p>
       <w:pPr>
+        <w:keepNext/>
         <w:spacing w:after="60"/>
         <w:jc w:val="center"/>
       </w:pPr>
@@ -536,6 +539,7 @@
     </w:p>
     <w:p>
       <w:pPr>
+        <w:keepNext/>
         <w:spacing w:before="100" w:after="0"/>
       </w:pPr>
       <w:r>
@@ -551,6 +555,7 @@
     </w:p>
     <w:p>
       <w:pPr>
+        <w:keepNext/>
         <w:spacing w:after="80"/>
       </w:pPr>
       <w:r>
@@ -566,6 +571,7 @@
     </w:p>
     <w:p>
       <w:pPr>
+        <w:keepNext/>
         <w:spacing w:after="60"/>
         <w:jc w:val="center"/>
       </w:pPr>
@@ -1394,6 +1400,7 @@
     </w:p>
     <w:p>
       <w:pPr>
+        <w:keepNext/>
         <w:spacing w:before="100" w:after="0"/>
       </w:pPr>
       <w:r>
@@ -1409,6 +1416,7 @@
     </w:p>
     <w:p>
       <w:pPr>
+        <w:keepNext/>
         <w:spacing w:after="80"/>
       </w:pPr>
       <w:r>
@@ -1424,6 +1432,7 @@
     </w:p>
     <w:p>
       <w:pPr>
+        <w:keepNext/>
         <w:spacing w:after="60"/>
         <w:jc w:val="center"/>
       </w:pPr>
@@ -1698,7 +1707,7 @@
           <w:color w:val="000000"/>
           <w:sz w:val="24"/>
         </w:rPr>
-        <w:t>The implementation alternates masks and permutations so every coordinate can influence every other coordinate across depth. Log-scale is bounded as a*tanh(raw/a). This guarantees finite positive scale for finite network outputs and limits local condition numbers. Zero initialization of each final conditioner layer makes the initial transformation the identity, reducing early optimization shocks. These safeguards preserve differentiability but do not prove global optimization or adequate expressiveness.</w:t>
+        <w:t>The implementation alternates masks and permutations so every coordinate can influence every other coordinate across depth. Log-scale is bounded as a*tanh(raw/a). This guarantees finite positive scale for finite network outputs and limits local condition numbers. Zero initialization makes each initial coupling map the identity; the full flow still includes its fixed coordinate permutations, reducing early optimization shocks. These safeguards preserve differentiability but do not prove global optimization or adequate expressiveness.</w:t>
       </w:r>
     </w:p>
     <w:p>
@@ -2390,6 +2399,7 @@
     </w:p>
     <w:p>
       <w:pPr>
+        <w:keepNext/>
         <w:spacing w:before="100" w:after="0"/>
       </w:pPr>
       <w:r>
@@ -2405,6 +2415,7 @@
     </w:p>
     <w:p>
       <w:pPr>
+        <w:keepNext/>
         <w:spacing w:after="80"/>
       </w:pPr>
       <w:r>
@@ -2420,6 +2431,7 @@
     </w:p>
     <w:p>
       <w:pPr>
+        <w:keepNext/>
         <w:spacing w:after="60"/>
         <w:jc w:val="center"/>
       </w:pPr>
@@ -2470,7 +2482,7 @@
           <w:color w:val="000000"/>
           <w:sz w:val="18"/>
         </w:rPr>
-        <w:t>Note. The Page curve is analytic. Telemetry entropy and fidelity are deterministic browser/report surrogates derived from the stated toy model; they are not fitted physical data.</w:t>
+        <w:t>Note. The Page curve is analytic. Telemetry entropy and fidelity are illustrative report proxies, not expectations derived from the normalized Gaussian state model. The browser uses the same squared-visibility recovery proxy with additional explanatory controls.</w:t>
       </w:r>
     </w:p>
     <w:p>
@@ -2518,7 +2530,7 @@
           <w:color w:val="000000"/>
           <w:sz w:val="24"/>
         </w:rPr>
-        <w:t>The baseline uses eight real telemetry coordinates, interpreted as four complex amplitudes only for the paired toy-state fidelity calculation. A frozen four-block conditional scrambler generates the reference density. The learned model contains eight conditional coupling blocks, 128-unit SiLU conditioners, time-mass context embeddings, and bounded log-scales. All default calculations use float64 arithmetic and explicit generators.</w:t>
+        <w:t>The baseline uses eight real telemetry coordinates, interpreted as four complex amplitudes only for the paired toy-state fidelity calculation. A frozen four-block conditional scrambler generates the reference density. The learned model contains eight conditional coupling blocks, 128-unit SiLU conditioners, time-mass context embeddings, and bounded log-scales. Default calculations use float64 and separate seeded streams for initialization, training, and evaluation.</w:t>
       </w:r>
     </w:p>
     <w:p>
@@ -3227,7 +3239,7 @@
           <w:color w:val="000000"/>
           <w:sz w:val="24"/>
         </w:rPr>
-        <w:t>The repository exposes a typed configuration hierarchy, command-line entry point, atomic JSON/CSV writers, CI across Python 3.11 and 3.12, and tests for quantum entropy, target normalization, exact inversion, and a differentiable smoke optimization. Generated results are excluded from source control until explicitly frozen for a release.</w:t>
+        <w:t>The repository exposes typed configuration, atomic JSON/CSV writers, CPU CI on Python 3.11 and 3.12, and finite-value checks. Each run saves trained and target states, source and artifact hashes, and separate random streams. COMPLETED records execution; scientific validation remains NOT_ASSESSED until preregistered tolerances and seed-level comparisons are evaluated.</w:t>
       </w:r>
     </w:p>
     <w:p>
@@ -3307,7 +3319,7 @@
           <w:color w:val="000000"/>
           <w:sz w:val="24"/>
         </w:rPr>
-        <w:t>At zero visibility, secret and accessible latent are independent, so expected fidelity is the random-overlap baseline 1/d for complex dimension d. At high visibility, a correctly aligned inverse approaches the secret up to residual nuisance and approximation error. The analytic surrogate used in browser and report figures is 1/d+(1-1/d)v(t)^2; it is a design expectation, not a trained result.</w:t>
+        <w:t>At zero visibility, secret and accessible latent are independent, so expected fidelity is the random-overlap baseline 1/d for complex dimension d. At high visibility, a correctly aligned inverse approaches the secret up to residual nuisance and approximation error. The analytic surrogate used in browser and report figures is 1/d+(1-1/d)v(t)^2; it is a heuristic interpolation, not the expected fidelity of normalized correlated Gaussian states and not a trained result.</w:t>
       </w:r>
     </w:p>
     <w:p>
@@ -3339,7 +3351,7 @@
           <w:color w:val="000000"/>
           <w:sz w:val="24"/>
         </w:rPr>
-        <w:t>The decoder is evaluated on held-out secrets and times, compared with an unconditioned flow and a no-alignment ablation, and summarized with seed-level confidence intervals. High likelihood with baseline fidelity is evidence of latent non-identifiability rather than successful decryption.</w:t>
+        <w:t>The code evaluates fresh secrets on a fixed time grid, with independent random-state null and known-scrambler inverse diagnostics. Pointwise Monte Carlo intervals condition on one trained model. Trained unconditioned/no-alignment ablations and seed-level intervals remain planned. High likelihood alone does not identify latent orientation or establish decoding.</w:t>
       </w:r>
     </w:p>
     <w:p>
@@ -4117,6 +4129,7 @@
     </w:p>
     <w:p>
       <w:pPr>
+        <w:keepNext/>
         <w:spacing w:before="100" w:after="0"/>
       </w:pPr>
       <w:r>
@@ -4132,6 +4145,7 @@
     </w:p>
     <w:p>
       <w:pPr>
+        <w:keepNext/>
         <w:spacing w:after="80"/>
       </w:pPr>
       <w:r>
@@ -4147,6 +4161,7 @@
     </w:p>
     <w:p>
       <w:pPr>
+        <w:keepNext/>
         <w:spacing w:after="60"/>
         <w:jc w:val="center"/>
       </w:pPr>
@@ -4250,6 +4265,7 @@
     </w:p>
     <w:p>
       <w:pPr>
+        <w:keepNext/>
         <w:spacing w:before="100" w:after="0"/>
       </w:pPr>
       <w:r>
@@ -4265,6 +4281,7 @@
     </w:p>
     <w:p>
       <w:pPr>
+        <w:keepNext/>
         <w:spacing w:after="80"/>
       </w:pPr>
       <w:r>
@@ -4280,6 +4297,7 @@
     </w:p>
     <w:p>
       <w:pPr>
+        <w:keepNext/>
         <w:spacing w:after="60"/>
         <w:jc w:val="center"/>
       </w:pPr>
@@ -5664,16 +5682,6 @@
           <w:color w:val="000000"/>
           <w:sz w:val="11"/>
         </w:rPr>
-        <w:br/>
-      </w:r>
-      <w:r>
-        <w:rPr>
-          <w:rFonts w:ascii="Liberation Mono" w:hAnsi="Liberation Mono"/>
-          <w:b w:val="0"/>
-          <w:i w:val="0"/>
-          <w:color w:val="000000"/>
-          <w:sz w:val="11"/>
-        </w:rPr>
         <w:t>ROOT = Path(__file__).resolve().parent</w:t>
         <w:br/>
       </w:r>
@@ -6114,6 +6122,17 @@
           <w:color w:val="000000"/>
           <w:sz w:val="11"/>
         </w:rPr>
+        <w:t xml:space="preserve">    # Heuristic interpolation, not E[normalized Gaussian state fidelity].</w:t>
+        <w:br/>
+      </w:r>
+      <w:r>
+        <w:rPr>
+          <w:rFonts w:ascii="Liberation Mono" w:hAnsi="Liberation Mono"/>
+          <w:b w:val="0"/>
+          <w:i w:val="0"/>
+          <w:color w:val="000000"/>
+          <w:sz w:val="11"/>
+        </w:rPr>
         <w:t xml:space="preserve">    floor = 1.0 / complex_dimension</w:t>
         <w:br/>
       </w:r>
@@ -8166,7 +8185,7 @@
           <w:color w:val="000000"/>
           <w:sz w:val="11"/>
         </w:rPr>
-        <w:t xml:space="preserve">        "seed_status": "deterministic analytic benchmark",</w:t>
+        <w:t xml:space="preserve">        "seed_status": "analytic Page benchmark; illustrative entropy and fidelity proxies",</w:t>
         <w:br/>
       </w:r>
       <w:r>

</xml_diff>